<commit_message>
docs: align DASS package decision
</commit_message>
<xml_diff>
--- a/PRD_Sistem_Psikotes_CPMI.docx
+++ b/PRD_Sistem_Psikotes_CPMI.docx
@@ -91,7 +91,7 @@
           <w:sz w:val="20"/>
           <w:szCs w:val="20"/>
         </w:rPr>
-        <w:t xml:space="preserve">Versi PRD 1.1 (FINAL) · 20 Agustus 2026</w:t>
+        <w:t>Versi PRD 1.2 (FINAL) · 8 September 2026</w:t>
       </w:r>
     </w:p>
     <w:p>
@@ -2620,7 +2620,7 @@
           <w:sz w:val="19"/>
           <w:szCs w:val="19"/>
         </w:rPr>
-        <w:t xml:space="preserve">Registrasi → verifikasi identitas (foto vs KTP/paspor) → consent A (psikotes) + consent B (DASS, boleh ditolak) → penetapan bidang kerja tujuan (menentukan standar) → pembayaran → uji perangkat → penjadwalan.</w:t>
+        <w:t>Registrasi → verifikasi identitas (foto vs KTP/paspor) → consent A (psikotes) + consent B (DASS-21, dicatat terpisah) → penetapan bidang kerja tujuan (menentukan standar) → pembayaran → uji perangkat → penjadwalan.</w:t>
       </w:r>
     </w:p>
     <w:p>
@@ -3828,14 +3828,14 @@
           <w:sz w:val="20"/>
           <w:szCs w:val="20"/>
         </w:rPr>
-        <w:t xml:space="preserve">Consent B terpisah dan boleh ditolak </w:t>
+        <w:t xml:space="preserve">DASS-21 tersedia sebagai paket mandiri gratis. </w:t>
       </w:r>
       <w:r>
         <w:rPr>
           <w:sz w:val="20"/>
           <w:szCs w:val="20"/>
         </w:rPr>
-        <w:t xml:space="preserve">tanpa menghentikan psikotes; bila ditolak, Bagian III laporan diberi keterangan “tidak dilaksanakan atas pilihan peserta”.</w:t>
+        <w:t>Setiap paket psikotes utama menyertakan DASS-21 secara otomatis tanpa kontrol peserta untuk menambah atau menghapusnya. Consent dan data DASS-21 tetap dicatat serta diproses terpisah.</w:t>
       </w:r>
     </w:p>
     <w:p>
@@ -4030,7 +4030,7 @@
           <w:sz w:val="18"/>
           <w:szCs w:val="18"/>
         </w:rPr>
-        <w:t xml:space="preserve">Dua consent terpisah: A (psikotes, wajib) dan B (DASS, wajib-terpisah, boleh ditolak).</w:t>
+        <w:t>Dua consent dicatat terpisah: A untuk psikotes dan B untuk DASS-21. Paket DASS-21 mandiri tetap tersedia; setiap paket psikotes utama menyertakan DASS-21 otomatis tanpa kontrol tambah/hapus oleh peserta.</w:t>
       </w:r>
     </w:p>
     <w:p>
@@ -8492,7 +8492,7 @@
         <w:sz w:val="15"/>
         <w:szCs w:val="15"/>
       </w:rPr>
-      <w:t xml:space="preserve">RAHASIA · v1.1 FINAL · 20 Agustus 2026 — Hal. </w:t>
+      <w:t xml:space="preserve">RAHASIA · v1.2 FINAL · 8 September 2026 — Hal. </w:t>
     </w:r>
     <w:r>
       <w:rPr>

</xml_diff>

<commit_message>
docs: resolve psychometric source conflicts
</commit_message>
<xml_diff>
--- a/PRD_Sistem_Psikotes_CPMI.docx
+++ b/PRD_Sistem_Psikotes_CPMI.docx
@@ -91,7 +91,7 @@
           <w:sz w:val="20"/>
           <w:szCs w:val="20"/>
         </w:rPr>
-        <w:t>Versi PRD 1.2 (FINAL) · 8 September 2026</w:t>
+        <w:t>Versi PRD 1.3 (FINAL) · 8 September 2026</w:t>
       </w:r>
     </w:p>
     <w:p>
@@ -105,7 +105,7 @@
           <w:sz w:val="18"/>
           <w:szCs w:val="18"/>
         </w:rPr>
-        <w:t xml:space="preserve">Selaras dengan SPEC v4.2 · HPP CPMI v2.3 · seluruh butir psikometri terkunci</w:t>
+        <w:t>Selaras dengan SPEC v4.3 · HPP CPMI v2.3 · kontrak psikometri SCORING-4.3.0</w:t>
       </w:r>
     </w:p>
     <w:p>
@@ -2788,7 +2788,7 @@
           <w:sz w:val="20"/>
           <w:szCs w:val="20"/>
         </w:rPr>
-        <w:t xml:space="preserve">Detail rumus, tabel norma, dan pseudocode ada di SPEC v4.0 (§4–§6). Di sini kebutuhan tingkat produk.</w:t>
+        <w:t>Detail rumus, tabel norma, dan pseudocode ada di SPEC v4.3 (§4–§6). Jika sumber lama bertentangan, urutannya adalah PRD terbaru, konfirmasi akhir psikolog, Tabel Lookup Skoring v1.1, golden test, lalu dokumen teknis lama. Kontrak final memakai IQ sheet 04, PAPI jarak dari zona putih, RMIB sheet 11 dengan competition ranking, serta faktor Kraepelin dibulatkan half-up tiga desimal sebelum lookup.</w:t>
       </w:r>
     </w:p>
     <w:p>
@@ -6100,7 +6100,7 @@
                 <w:sz w:val="18"/>
                 <w:szCs w:val="18"/>
               </w:rPr>
-              <w:t xml:space="preserve">24 uji penerimaan hijau, termasuk T-07</w:t>
+              <w:t>28 uji penerimaan hijau, termasuk T-07</w:t>
             </w:r>
           </w:p>
         </w:tc>
@@ -8283,14 +8283,13 @@
           <w:sz w:val="20"/>
           <w:szCs w:val="20"/>
         </w:rPr>
-        <w:t xml:space="preserve">SPEC v4.0 </w:t>
+        <w:t>SPEC v4.3 — spesifikasi teknik lengkap (arsitektur, model data, skoring, uji penerimaan, fase build).</w:t>
       </w:r>
       <w:r>
         <w:rPr>
           <w:sz w:val="20"/>
           <w:szCs w:val="20"/>
         </w:rPr>
-        <w:t xml:space="preserve">— spesifikasi teknik lengkap (arsitektur, model data, skoring, uji penerimaan, fase build).</w:t>
       </w:r>
     </w:p>
     <w:p>
@@ -8492,7 +8491,7 @@
         <w:sz w:val="15"/>
         <w:szCs w:val="15"/>
       </w:rPr>
-      <w:t xml:space="preserve">RAHASIA · v1.2 FINAL · 8 September 2026 — Hal. </w:t>
+      <w:t xml:space="preserve">RAHASIA · v1.3 FINAL · 8 September 2026 — Hal. </w:t>
     </w:r>
     <w:r>
       <w:rPr>

</xml_diff>